<commit_message>
Release 1.20.0 — SE Agreement/Work Order document fixes, download-all progress, packaging trim
- Agreement/Work Order "Download all documents" now works for SE offices
  too, with live "Preparing X of Y" / "Saving X of Y" progress
- Fixed a crash opening Bid Evaluation / Agency Approval notes
  (html-to-docx doesn't support % table-cell widths)
- Fixed SE Work Order's permanently-blank date, Memo to EE's blank circle,
  the Item No. tag leaking into Name of Work, SE Agreement Bond page
  layout/date alignment, Agreement Put-up Note Sub/Ref alignment, Memo
  Concluding Agreement + Contract Deed agency-address formatting, and a
  stray blank in the TS Note's Lr no. line
- Removed the duplicate "Change your Office" link from the Works List page
- electron-builder.yml: excluded confirmed-dead compile-time-only files
  (transformers.js src/types, opencv-js types, lodash/fp, dayjs locales)

Co-Authored-By: Claude Sonnet 5 <noreply@anthropic.com>
</commit_message>
<xml_diff>
--- a/resources/loa-se-reserved-template.docx
+++ b/resources/loa-se-reserved-template.docx
@@ -977,6 +977,34 @@
     </w:p>
     <w:p>
       <w:pPr>
+        <w:spacing w:before="0" w:after="60" w:line="240" w:lineRule="auto"/>
+      </w:pPr>
+      <w:r>
+        <w:rPr>
+          <w:b w:val="0"/>
+          <w:i w:val="0"/>
+          <w:u w:val="none"/>
+          <w:rFonts w:ascii="Times New Roman" w:hAnsi="Times New Roman" w:cs="Times New Roman"/>
+        </w:rPr>
+        <w:t xml:space="preserve"/>
+      </w:r>
+    </w:p>
+    <w:p>
+      <w:pPr>
+        <w:spacing w:before="0" w:after="60" w:line="240" w:lineRule="auto"/>
+      </w:pPr>
+      <w:r>
+        <w:rPr>
+          <w:b w:val="0"/>
+          <w:i w:val="0"/>
+          <w:u w:val="none"/>
+          <w:rFonts w:ascii="Times New Roman" w:hAnsi="Times New Roman" w:cs="Times New Roman"/>
+        </w:rPr>
+        <w:t xml:space="preserve"/>
+      </w:r>
+    </w:p>
+    <w:p>
+      <w:pPr>
         <w:spacing w:before="20" w:after="0" w:line="240" w:lineRule="auto"/>
         <w:jc w:val="right"/>
       </w:pPr>

</xml_diff>

<commit_message>
Release 1.27.0 — Issue Documents themes, OCR/PDF hang fixes, faster batch generation & previews
Co-Authored-By: Claude Sonnet 5 <noreply@anthropic.com>
</commit_message>
<xml_diff>
--- a/resources/loa-se-reserved-template.docx
+++ b/resources/loa-se-reserved-template.docx
@@ -1044,20 +1044,6 @@
           <w:u w:val="none"/>
           <w:rFonts w:ascii="Times New Roman" w:hAnsi="Times New Roman" w:cs="Times New Roman"/>
         </w:rPr>
-        <w:t>Copy Submitted to the Chief Engineer, CMC for favor of information please.</w:t>
-      </w:r>
-    </w:p>
-    <w:p>
-      <w:pPr>
-        <w:spacing w:before="0" w:after="0" w:line="240" w:lineRule="auto"/>
-      </w:pPr>
-      <w:r>
-        <w:rPr>
-          <w:b w:val="0"/>
-          <w:i w:val="0"/>
-          <w:u w:val="none"/>
-          <w:rFonts w:ascii="Times New Roman" w:hAnsi="Times New Roman" w:cs="Times New Roman"/>
-        </w:rPr>
         <w:t>Copy to:</w:t>
       </w:r>
     </w:p>

</xml_diff>